<commit_message>
fix: consolidate stockholder consent into openagreements-prefixed slug with variable signers
Delete the legacy stockholder-consent-safe directory and port its
variable-signer {FOR} loop into the Contract IR canonical template at
openagreements-stockholder-consent-safe. This gives the stockholder
consent the same architecture as the board consent: Contract IR source
with loop-based signature blocks that render any number of signers.

- Replace fixed stockholder_1/2/3_name fields with stockholders array
  in content.md, schema.yaml, and metadata.yaml
- Regenerate template.docx and template.md from Contract IR
- Update tests to use Contract IR render → fill pipeline
- Remove legacy slug from repo README template table
</commit_message>
<xml_diff>
--- a/content/templates/openagreements-stockholder-consent-safe/template.docx
+++ b/content/templates/openagreements-stockholder-consent-safe/template.docx
@@ -178,6 +178,14 @@
     </w:p>
     <w:p>
       <w:pPr>
+        <w:pStyle w:val="Normal"/>
+      </w:pPr>
+      <w:r>
+        <w:t xml:space="preserve">{FOR stockholder IN stockholders}</w:t>
+      </w:r>
+    </w:p>
+    <w:p>
+      <w:pPr>
         <w:pStyle w:val="OABlockSignatureLine"/>
       </w:pPr>
       <w:r>
@@ -189,7 +197,7 @@
         <w:pStyle w:val="OABlockSignatureName"/>
       </w:pPr>
       <w:r>
-        <w:t xml:space="preserve">{stockholder_1_name}</w:t>
+        <w:t xml:space="preserve">{$stockholder.name}</w:t>
       </w:r>
     </w:p>
     <w:p>
@@ -205,56 +213,10 @@
     </w:p>
     <w:p>
       <w:pPr>
-        <w:pStyle w:val="OABlockSignatureLine"/>
-      </w:pPr>
-      <w:r>
-        <w:t xml:space="preserve">______________________________</w:t>
-      </w:r>
-    </w:p>
-    <w:p>
-      <w:pPr>
-        <w:pStyle w:val="OABlockSignatureName"/>
-      </w:pPr>
-      <w:r>
-        <w:t xml:space="preserve">{stockholder_2_name}</w:t>
-      </w:r>
-    </w:p>
-    <w:p>
-      <w:pPr>
-        <w:pStyle w:val="OABlockSignatureDate"/>
-      </w:pPr>
-      <w:r>
-        <w:t xml:space="preserve">Date: </w:t>
-      </w:r>
-      <w:r>
-        <w:t xml:space="preserve">{effective_date}</w:t>
-      </w:r>
-    </w:p>
-    <w:p>
-      <w:pPr>
-        <w:pStyle w:val="OABlockSignatureLine"/>
-      </w:pPr>
-      <w:r>
-        <w:t xml:space="preserve">______________________________</w:t>
-      </w:r>
-    </w:p>
-    <w:p>
-      <w:pPr>
-        <w:pStyle w:val="OABlockSignatureName"/>
-      </w:pPr>
-      <w:r>
-        <w:t xml:space="preserve">{stockholder_3_name}</w:t>
-      </w:r>
-    </w:p>
-    <w:p>
-      <w:pPr>
-        <w:pStyle w:val="OABlockSignatureDate"/>
-      </w:pPr>
-      <w:r>
-        <w:t xml:space="preserve">Date: </w:t>
-      </w:r>
-      <w:r>
-        <w:t xml:space="preserve">{effective_date}</w:t>
+        <w:pStyle w:val="Normal"/>
+      </w:pPr>
+      <w:r>
+        <w:t xml:space="preserve">{END-FOR stockholder}</w:t>
       </w:r>
     </w:p>
     <w:sectPr>

</xml_diff>

<commit_message>
fix: consolidate stockholder consent into openagreements-prefixed slug with variable signers (#184)
Delete the legacy stockholder-consent-safe directory and port its
variable-signer {FOR} loop into the Contract IR canonical template at
openagreements-stockholder-consent-safe. This gives the stockholder
consent the same architecture as the board consent: Contract IR source
with loop-based signature blocks that render any number of signers.

- Replace fixed stockholder_1/2/3_name fields with stockholders array
  in content.md, schema.yaml, and metadata.yaml
- Regenerate template.docx and template.md from Contract IR
- Update tests to use Contract IR render → fill pipeline
- Remove legacy slug from repo README template table
</commit_message>
<xml_diff>
--- a/content/templates/openagreements-stockholder-consent-safe/template.docx
+++ b/content/templates/openagreements-stockholder-consent-safe/template.docx
@@ -178,6 +178,14 @@
     </w:p>
     <w:p>
       <w:pPr>
+        <w:pStyle w:val="Normal"/>
+      </w:pPr>
+      <w:r>
+        <w:t xml:space="preserve">{FOR stockholder IN stockholders}</w:t>
+      </w:r>
+    </w:p>
+    <w:p>
+      <w:pPr>
         <w:pStyle w:val="OABlockSignatureLine"/>
       </w:pPr>
       <w:r>
@@ -189,7 +197,7 @@
         <w:pStyle w:val="OABlockSignatureName"/>
       </w:pPr>
       <w:r>
-        <w:t xml:space="preserve">{stockholder_1_name}</w:t>
+        <w:t xml:space="preserve">{$stockholder.name}</w:t>
       </w:r>
     </w:p>
     <w:p>
@@ -205,56 +213,10 @@
     </w:p>
     <w:p>
       <w:pPr>
-        <w:pStyle w:val="OABlockSignatureLine"/>
-      </w:pPr>
-      <w:r>
-        <w:t xml:space="preserve">______________________________</w:t>
-      </w:r>
-    </w:p>
-    <w:p>
-      <w:pPr>
-        <w:pStyle w:val="OABlockSignatureName"/>
-      </w:pPr>
-      <w:r>
-        <w:t xml:space="preserve">{stockholder_2_name}</w:t>
-      </w:r>
-    </w:p>
-    <w:p>
-      <w:pPr>
-        <w:pStyle w:val="OABlockSignatureDate"/>
-      </w:pPr>
-      <w:r>
-        <w:t xml:space="preserve">Date: </w:t>
-      </w:r>
-      <w:r>
-        <w:t xml:space="preserve">{effective_date}</w:t>
-      </w:r>
-    </w:p>
-    <w:p>
-      <w:pPr>
-        <w:pStyle w:val="OABlockSignatureLine"/>
-      </w:pPr>
-      <w:r>
-        <w:t xml:space="preserve">______________________________</w:t>
-      </w:r>
-    </w:p>
-    <w:p>
-      <w:pPr>
-        <w:pStyle w:val="OABlockSignatureName"/>
-      </w:pPr>
-      <w:r>
-        <w:t xml:space="preserve">{stockholder_3_name}</w:t>
-      </w:r>
-    </w:p>
-    <w:p>
-      <w:pPr>
-        <w:pStyle w:val="OABlockSignatureDate"/>
-      </w:pPr>
-      <w:r>
-        <w:t xml:space="preserve">Date: </w:t>
-      </w:r>
-      <w:r>
-        <w:t xml:space="preserve">{effective_date}</w:t>
+        <w:pStyle w:val="Normal"/>
+      </w:pPr>
+      <w:r>
+        <w:t xml:space="preserve">{END-FOR stockholder}</w:t>
       </w:r>
     </w:p>
     <w:sectPr>

</xml_diff>